<commit_message>
Paper v2: Section 6 (varying the benchmark), narrowed claims, SPEC v2 transparency
</commit_message>
<xml_diff>
--- a/docs/Sun_2026_Where_the_Benchmark_Can_Err.docx
+++ b/docs/Sun_2026_Where_the_Benchmark_Can_Err.docx
@@ -87,7 +87,7 @@
           <w:b w:val="0"/>
           <w:i w:val="0"/>
         </w:rPr>
-        <w:t>In an earlier study of chess, human players deviated from a strictly stronger engine toward sharper positions, and the deviations were not repaid. This study asks whether deviation from a model earns a return in a domain where the model itself can err. I use the one ForecastBench round with individual-level human forecasts (July 2024): 40 superforecasters and 500 public forecasters on 578 resolved targets across 162 questions, matched to 34 language-model variants that saw the same information. The benchmark is the single best model, chosen on questions the humans never forecast. Five hypotheses were locked and pushed to a public repository before any analysis. Superforecasters beat the benchmark on average (+3.4 Brier points ×100) and public forecasters did not (−7.8). The median forecast of each group carried outcome information the benchmark did not encompass (coefficients 1.79 and 0.97, both intervals above zero); the public result is the cleaner comparison because superforecasters deliberated in a group stage. Per-forecaster gain over the benchmark was stable across a split of the round's targets (r = 0.78 superforecasters, 0.64 public). The gain did not rise where the models disagreed with one another against the single best model, and this null held under an alternative disagreement measure and on dataset questions only; against the median of the 34 models it rose, so the moderator result depends on the benchmark. Whether extremizing relative to the model pays depends on the scoring rule: the coefficient is positive under Brier and negative under the log score, and a post-hoc diagnostic locates the disagreement in a tail of confident public errors. The pre-registered extremization-by-disagreement interaction reversed sign between the pilot and the full sample and is not interpreted. Set beside the chess result, the two domains agree that the direction of deviation is not simply profitable and that the gain is not located where the benchmark is least certain. They differ on whether human deviation carries information at all, which is consistent with the fallibility of the benchmark deciding that. Two amendments before execution, one after the pilot, and one post-results diagnostic are disclosed in full.</w:t>
+        <w:t>In an earlier study of chess, human players deviated from a strictly stronger engine toward sharper positions, and the deviations were not repaid. This study asks whether deviation from a model earns a return in a domain where the model itself can err. I use the one ForecastBench round with individual-level human forecasts (July 2024): 40 superforecasters and 500 public forecasters on 578 resolved targets across 162 questions, matched to 34 language-model variants that saw the same information. The benchmark is the single best model, chosen on questions the humans never forecast. Five hypotheses were locked and pushed to a public repository before any analysis. Superforecasters beat the benchmark on average (+3.4 Brier points ×100) and public forecasters did not (−7.8). The median forecast of each group carried outcome information the best single model did not encompass (coefficients 1.79 and 0.97, both intervals above zero); the public result is the cleaner comparison because superforecasters deliberated in a group stage. A second locked specification then varied the benchmark across all 34 model variants. The information the human median adds does not fall as the model improves within this generation of models, but an exploratory comparison against the median of the other 33 models found that only the superforecasters add information on a scale-free measure; the public median does not add more than another model-like source would. Per-forecaster gain over the benchmark was stable across a split of the round's targets (r = 0.78 superforecasters, 0.64 public). The gain did not rise where the models disagreed with one another against the single best model, and this null held under an alternative disagreement measure and on dataset questions only; against the median of the 34 models it rose, so the moderator result depends on the benchmark. Whether extremizing relative to the model pays depends on the scoring rule: the coefficient is positive under Brier and negative under the log score, and a post-hoc diagnostic locates the disagreement in a tail of confident public errors. The pre-registered extremization-by-disagreement interaction reversed sign between the pilot and the full sample and is not interpreted. Set beside the chess result, the two domains agree that the direction of deviation is not simply profitable and that the gain is not located where the benchmark is least certain. They differ on whether human deviation carries information beyond a single model at all, which is consistent with the fallibility of the benchmark deciding that. Two specifications and five amendments, two of them post-results diagnostics, are disclosed in full.</w:t>
       </w:r>
     </w:p>
     <w:p>
@@ -144,7 +144,7 @@
           <w:b w:val="0"/>
           <w:i w:val="0"/>
         </w:rPr>
-        <w:t>Five hypotheses were pre-specified and locked in a public repository before any analysis. H1 asks whether humans beat the model on average. H2 asks whether the human forecast carries outcome information the model does not encompass. H3 asks whether the return is larger where the models disagree. H4 asks whether extremizing pays. H5 asks whether the per-forecaster return is stable within the round. The section order below follows that list. A comparison with the chess results follows the results, and a methods-transparency section records everything that changed after the lock.</w:t>
+        <w:t>Five hypotheses were pre-specified and locked in a public repository before any analysis. H1 asks whether humans beat the model on average. H2 asks whether the human forecast carries outcome information the model does not encompass. H3 asks whether the return is larger where the models disagree. H4 asks whether extremizing pays. H5 asks whether the per-forecaster return is stable within the round. The section order below follows that list. A comparison with the chess results follows the results. Section 6 then reports a second locked specification that varies the benchmark across all 34 model variants, and a methods-transparency section records everything that changed after each lock.</w:t>
       </w:r>
     </w:p>
     <w:p>
@@ -287,686 +287,6 @@
     </w:p>
     <w:p>
       <w:pPr>
-        <w:keepNext/>
-        <w:spacing w:after="40"/>
-      </w:pPr>
-      <w:r>
-        <w:rPr>
-          <w:b/>
-          <w:sz w:val="20"/>
-        </w:rPr>
-        <w:t>Table 1. Row-level quantities and their chess counterparts.</w:t>
-      </w:r>
-    </w:p>
-    <w:tbl>
-      <w:tblPr>
-        <w:tblStyle w:val="TableGrid"/>
-        <w:tblW w:type="auto" w:w="0"/>
-        <w:jc w:val="center"/>
-        <w:tblLook w:firstColumn="1" w:firstRow="1" w:lastColumn="0" w:lastRow="0" w:noHBand="0" w:noVBand="1" w:val="04A0"/>
-      </w:tblPr>
-      <w:tblGrid>
-        <w:gridCol w:w="3120"/>
-        <w:gridCol w:w="3120"/>
-        <w:gridCol w:w="3120"/>
-      </w:tblGrid>
-      <w:tr>
-        <w:trPr>
-          <w:cantSplit/>
-        </w:trPr>
-        <w:tc>
-          <w:tcPr>
-            <w:tcW w:type="dxa" w:w="1296"/>
-          </w:tcPr>
-          <w:p>
-            <w:pPr>
-              <w:keepNext/>
-            </w:pPr>
-            <w:r/>
-            <w:r>
-              <w:rPr>
-                <w:b/>
-                <w:sz w:val="18"/>
-              </w:rPr>
-              <w:t>Symbol</w:t>
-            </w:r>
-          </w:p>
-        </w:tc>
-        <w:tc>
-          <w:tcPr>
-            <w:tcW w:type="dxa" w:w="4608"/>
-          </w:tcPr>
-          <w:p>
-            <w:pPr>
-              <w:keepNext/>
-            </w:pPr>
-            <w:r/>
-            <w:r>
-              <w:rPr>
-                <w:b/>
-                <w:sz w:val="18"/>
-              </w:rPr>
-              <w:t>Definition</w:t>
-            </w:r>
-          </w:p>
-        </w:tc>
-        <w:tc>
-          <w:tcPr>
-            <w:tcW w:type="dxa" w:w="3456"/>
-          </w:tcPr>
-          <w:p>
-            <w:pPr>
-              <w:keepNext/>
-            </w:pPr>
-            <w:r/>
-            <w:r>
-              <w:rPr>
-                <w:b/>
-                <w:sz w:val="18"/>
-              </w:rPr>
-              <w:t>Chess counterpart (Sun, 2026)</w:t>
-            </w:r>
-          </w:p>
-        </w:tc>
-      </w:tr>
-      <w:tr>
-        <w:trPr>
-          <w:cantSplit/>
-        </w:trPr>
-        <w:tc>
-          <w:tcPr>
-            <w:tcW w:type="dxa" w:w="1296"/>
-          </w:tcPr>
-          <w:p>
-            <w:pPr>
-              <w:keepNext/>
-              <w:spacing w:after="0" w:before="0"/>
-            </w:pPr>
-            <w:r/>
-            <w:r>
-              <w:rPr>
-                <w:sz w:val="18"/>
-              </w:rPr>
-              <w:t>p_h</w:t>
-            </w:r>
-          </w:p>
-        </w:tc>
-        <w:tc>
-          <w:tcPr>
-            <w:tcW w:type="dxa" w:w="4608"/>
-          </w:tcPr>
-          <w:p>
-            <w:pPr>
-              <w:keepNext/>
-              <w:spacing w:after="0" w:before="0"/>
-            </w:pPr>
-            <w:r/>
-            <w:r>
-              <w:rPr>
-                <w:sz w:val="18"/>
-              </w:rPr>
-              <w:t>the human's forecast</w:t>
-            </w:r>
-          </w:p>
-        </w:tc>
-        <w:tc>
-          <w:tcPr>
-            <w:tcW w:type="dxa" w:w="3456"/>
-          </w:tcPr>
-          <w:p>
-            <w:pPr>
-              <w:keepNext/>
-              <w:spacing w:after="0" w:before="0"/>
-            </w:pPr>
-            <w:r/>
-            <w:r>
-              <w:rPr>
-                <w:sz w:val="18"/>
-              </w:rPr>
-              <w:t>the move played</w:t>
-            </w:r>
-          </w:p>
-        </w:tc>
-      </w:tr>
-      <w:tr>
-        <w:trPr>
-          <w:cantSplit/>
-        </w:trPr>
-        <w:tc>
-          <w:tcPr>
-            <w:tcW w:type="dxa" w:w="1296"/>
-          </w:tcPr>
-          <w:p>
-            <w:pPr>
-              <w:keepNext/>
-              <w:spacing w:after="0" w:before="0"/>
-            </w:pPr>
-            <w:r/>
-            <w:r>
-              <w:rPr>
-                <w:sz w:val="18"/>
-              </w:rPr>
-              <w:t>p_a</w:t>
-            </w:r>
-          </w:p>
-        </w:tc>
-        <w:tc>
-          <w:tcPr>
-            <w:tcW w:type="dxa" w:w="4608"/>
-          </w:tcPr>
-          <w:p>
-            <w:pPr>
-              <w:keepNext/>
-              <w:spacing w:after="0" w:before="0"/>
-            </w:pPr>
-            <w:r/>
-            <w:r>
-              <w:rPr>
-                <w:sz w:val="18"/>
-              </w:rPr>
-              <w:t>benchmark (a) forecast, single best model</w:t>
-            </w:r>
-          </w:p>
-        </w:tc>
-        <w:tc>
-          <w:tcPr>
-            <w:tcW w:type="dxa" w:w="3456"/>
-          </w:tcPr>
-          <w:p>
-            <w:pPr>
-              <w:keepNext/>
-              <w:spacing w:after="0" w:before="0"/>
-            </w:pPr>
-            <w:r/>
-            <w:r>
-              <w:rPr>
-                <w:sz w:val="18"/>
-              </w:rPr>
-              <w:t>engine first choice</w:t>
-            </w:r>
-          </w:p>
-        </w:tc>
-      </w:tr>
-      <w:tr>
-        <w:trPr>
-          <w:cantSplit/>
-        </w:trPr>
-        <w:tc>
-          <w:tcPr>
-            <w:tcW w:type="dxa" w:w="1296"/>
-          </w:tcPr>
-          <w:p>
-            <w:pPr>
-              <w:keepNext/>
-              <w:spacing w:after="0" w:before="0"/>
-            </w:pPr>
-            <w:r/>
-            <w:r>
-              <w:rPr>
-                <w:sz w:val="18"/>
-              </w:rPr>
-              <w:t>o</w:t>
-            </w:r>
-          </w:p>
-        </w:tc>
-        <w:tc>
-          <w:tcPr>
-            <w:tcW w:type="dxa" w:w="4608"/>
-          </w:tcPr>
-          <w:p>
-            <w:pPr>
-              <w:keepNext/>
-              <w:spacing w:after="0" w:before="0"/>
-            </w:pPr>
-            <w:r/>
-            <w:r>
-              <w:rPr>
-                <w:sz w:val="18"/>
-              </w:rPr>
-              <w:t>outcome, 0 or 1</w:t>
-            </w:r>
-          </w:p>
-        </w:tc>
-        <w:tc>
-          <w:tcPr>
-            <w:tcW w:type="dxa" w:w="3456"/>
-          </w:tcPr>
-          <w:p>
-            <w:pPr>
-              <w:keepNext/>
-              <w:spacing w:after="0" w:before="0"/>
-            </w:pPr>
-            <w:r/>
-            <w:r>
-              <w:rPr>
-                <w:sz w:val="18"/>
-              </w:rPr>
-              <w:t>game result</w:t>
-            </w:r>
-          </w:p>
-        </w:tc>
-      </w:tr>
-      <w:tr>
-        <w:trPr>
-          <w:cantSplit/>
-        </w:trPr>
-        <w:tc>
-          <w:tcPr>
-            <w:tcW w:type="dxa" w:w="1296"/>
-          </w:tcPr>
-          <w:p>
-            <w:pPr>
-              <w:keepNext/>
-              <w:spacing w:after="0" w:before="0"/>
-            </w:pPr>
-            <w:r/>
-            <w:r>
-              <w:rPr>
-                <w:sz w:val="18"/>
-              </w:rPr>
-              <w:t>G_a</w:t>
-            </w:r>
-          </w:p>
-        </w:tc>
-        <w:tc>
-          <w:tcPr>
-            <w:tcW w:type="dxa" w:w="4608"/>
-          </w:tcPr>
-          <w:p>
-            <w:pPr>
-              <w:keepNext/>
-              <w:spacing w:after="0" w:before="0"/>
-            </w:pPr>
-            <w:r/>
-            <w:r>
-              <w:rPr>
-                <w:sz w:val="18"/>
-              </w:rPr>
-              <w:t>BS(p_a) − BS(p_h); positive = human beat the model on this target</w:t>
-            </w:r>
-          </w:p>
-        </w:tc>
-        <w:tc>
-          <w:tcPr>
-            <w:tcW w:type="dxa" w:w="3456"/>
-          </w:tcPr>
-          <w:p>
-            <w:pPr>
-              <w:keepNext/>
-              <w:spacing w:after="0" w:before="0"/>
-            </w:pPr>
-            <w:r/>
-            <w:r>
-              <w:rPr>
-                <w:sz w:val="18"/>
-              </w:rPr>
-              <w:t>net gain of the deviation in win probability</w:t>
-            </w:r>
-          </w:p>
-        </w:tc>
-      </w:tr>
-      <w:tr>
-        <w:trPr>
-          <w:cantSplit/>
-        </w:trPr>
-        <w:tc>
-          <w:tcPr>
-            <w:tcW w:type="dxa" w:w="1296"/>
-          </w:tcPr>
-          <w:p>
-            <w:pPr>
-              <w:keepNext/>
-              <w:spacing w:after="0" w:before="0"/>
-            </w:pPr>
-            <w:r/>
-            <w:r>
-              <w:rPr>
-                <w:sz w:val="18"/>
-              </w:rPr>
-              <w:t>D_a, absD_a</w:t>
-            </w:r>
-          </w:p>
-        </w:tc>
-        <w:tc>
-          <w:tcPr>
-            <w:tcW w:type="dxa" w:w="4608"/>
-          </w:tcPr>
-          <w:p>
-            <w:pPr>
-              <w:keepNext/>
-              <w:spacing w:after="0" w:before="0"/>
-            </w:pPr>
-            <w:r/>
-            <w:r>
-              <w:rPr>
-                <w:sz w:val="18"/>
-              </w:rPr>
-              <w:t>p_h − p_a and its absolute value</w:t>
-            </w:r>
-          </w:p>
-        </w:tc>
-        <w:tc>
-          <w:tcPr>
-            <w:tcW w:type="dxa" w:w="3456"/>
-          </w:tcPr>
-          <w:p>
-            <w:pPr>
-              <w:keepNext/>
-              <w:spacing w:after="0" w:before="0"/>
-            </w:pPr>
-            <w:r/>
-            <w:r>
-              <w:rPr>
-                <w:sz w:val="18"/>
-              </w:rPr>
-              <w:t>evaluation gap between played and best move</w:t>
-            </w:r>
-          </w:p>
-        </w:tc>
-      </w:tr>
-      <w:tr>
-        <w:trPr>
-          <w:cantSplit/>
-        </w:trPr>
-        <w:tc>
-          <w:tcPr>
-            <w:tcW w:type="dxa" w:w="1296"/>
-          </w:tcPr>
-          <w:p>
-            <w:pPr>
-              <w:keepNext/>
-              <w:spacing w:after="0" w:before="0"/>
-            </w:pPr>
-            <w:r/>
-            <w:r>
-              <w:rPr>
-                <w:sz w:val="18"/>
-              </w:rPr>
-              <w:t>EXT_a</w:t>
-            </w:r>
-          </w:p>
-        </w:tc>
-        <w:tc>
-          <w:tcPr>
-            <w:tcW w:type="dxa" w:w="4608"/>
-          </w:tcPr>
-          <w:p>
-            <w:pPr>
-              <w:keepNext/>
-              <w:spacing w:after="0" w:before="0"/>
-            </w:pPr>
-            <w:r/>
-            <w:r>
-              <w:rPr>
-                <w:sz w:val="18"/>
-              </w:rPr>
-              <w:t>|p_h − 0.5| − |p_a − 0.5|; positive = human more extreme than the model</w:t>
-            </w:r>
-          </w:p>
-        </w:tc>
-        <w:tc>
-          <w:tcPr>
-            <w:tcW w:type="dxa" w:w="3456"/>
-          </w:tcPr>
-          <w:p>
-            <w:pPr>
-              <w:keepNext/>
-              <w:spacing w:after="0" w:before="0"/>
-            </w:pPr>
-            <w:r/>
-            <w:r>
-              <w:rPr>
-                <w:sz w:val="18"/>
-              </w:rPr>
-              <w:t>sharpness (punishment-curve steepness) of the played move</w:t>
-            </w:r>
-          </w:p>
-        </w:tc>
-      </w:tr>
-      <w:tr>
-        <w:trPr>
-          <w:cantSplit/>
-        </w:trPr>
-        <w:tc>
-          <w:tcPr>
-            <w:tcW w:type="dxa" w:w="1296"/>
-          </w:tcPr>
-          <w:p>
-            <w:pPr>
-              <w:keepNext/>
-              <w:spacing w:after="0" w:before="0"/>
-            </w:pPr>
-            <w:r/>
-            <w:r>
-              <w:rPr>
-                <w:sz w:val="18"/>
-              </w:rPr>
-              <w:t>DIS</w:t>
-            </w:r>
-          </w:p>
-        </w:tc>
-        <w:tc>
-          <w:tcPr>
-            <w:tcW w:type="dxa" w:w="4608"/>
-          </w:tcPr>
-          <w:p>
-            <w:pPr>
-              <w:keepNext/>
-              <w:spacing w:after="0" w:before="0"/>
-            </w:pPr>
-            <w:r/>
-            <w:r>
-              <w:rPr>
-                <w:sz w:val="18"/>
-              </w:rPr>
-              <w:t>cross-model disagreement: mean of two within-scaffold SDs across the 17 base models</w:t>
-            </w:r>
-          </w:p>
-        </w:tc>
-        <w:tc>
-          <w:tcPr>
-            <w:tcW w:type="dxa" w:w="3456"/>
-          </w:tcPr>
-          <w:p>
-            <w:pPr>
-              <w:keepNext/>
-              <w:spacing w:after="0" w:before="0"/>
-            </w:pPr>
-            <w:r/>
-            <w:r>
-              <w:rPr>
-                <w:sz w:val="18"/>
-              </w:rPr>
-              <w:t>engine line spread</w:t>
-            </w:r>
-          </w:p>
-        </w:tc>
-      </w:tr>
-      <w:tr>
-        <w:trPr>
-          <w:cantSplit/>
-        </w:trPr>
-        <w:tc>
-          <w:tcPr>
-            <w:tcW w:type="dxa" w:w="1296"/>
-          </w:tcPr>
-          <w:p>
-            <w:pPr>
-              <w:keepNext/>
-              <w:spacing w:after="0" w:before="0"/>
-            </w:pPr>
-            <w:r/>
-            <w:r>
-              <w:rPr>
-                <w:sz w:val="18"/>
-              </w:rPr>
-              <w:t>CONF_a</w:t>
-            </w:r>
-          </w:p>
-        </w:tc>
-        <w:tc>
-          <w:tcPr>
-            <w:tcW w:type="dxa" w:w="4608"/>
-          </w:tcPr>
-          <w:p>
-            <w:pPr>
-              <w:keepNext/>
-              <w:spacing w:after="0" w:before="0"/>
-            </w:pPr>
-            <w:r/>
-            <w:r>
-              <w:rPr>
-                <w:sz w:val="18"/>
-              </w:rPr>
-              <w:t>|p_a − 0.5|, the model's own confidence</w:t>
-            </w:r>
-          </w:p>
-        </w:tc>
-        <w:tc>
-          <w:tcPr>
-            <w:tcW w:type="dxa" w:w="3456"/>
-          </w:tcPr>
-          <w:p>
-            <w:pPr>
-              <w:keepNext/>
-              <w:spacing w:after="0" w:before="0"/>
-            </w:pPr>
-            <w:r/>
-            <w:r>
-              <w:rPr>
-                <w:sz w:val="18"/>
-              </w:rPr>
-              <w:t>engine evaluation margin</w:t>
-            </w:r>
-          </w:p>
-        </w:tc>
-      </w:tr>
-      <w:tr>
-        <w:trPr>
-          <w:cantSplit/>
-        </w:trPr>
-        <w:tc>
-          <w:tcPr>
-            <w:tcW w:type="dxa" w:w="1296"/>
-          </w:tcPr>
-          <w:p>
-            <w:pPr>
-              <w:keepNext/>
-              <w:spacing w:after="0" w:before="0"/>
-            </w:pPr>
-            <w:r/>
-            <w:r>
-              <w:rPr>
-                <w:sz w:val="18"/>
-              </w:rPr>
-              <w:t>HZ, MKT, SRC</w:t>
-            </w:r>
-          </w:p>
-        </w:tc>
-        <w:tc>
-          <w:tcPr>
-            <w:tcW w:type="dxa" w:w="4608"/>
-          </w:tcPr>
-          <w:p>
-            <w:pPr>
-              <w:keepNext/>
-              <w:spacing w:after="0" w:before="0"/>
-            </w:pPr>
-            <w:r/>
-            <w:r>
-              <w:rPr>
-                <w:sz w:val="18"/>
-              </w:rPr>
-              <w:t>horizon in days (log), market indicator, question source</w:t>
-            </w:r>
-          </w:p>
-        </w:tc>
-        <w:tc>
-          <w:tcPr>
-            <w:tcW w:type="dxa" w:w="3456"/>
-          </w:tcPr>
-          <w:p>
-            <w:pPr>
-              <w:keepNext/>
-              <w:spacing w:after="0" w:before="0"/>
-            </w:pPr>
-            <w:r/>
-            <w:r>
-              <w:rPr>
-                <w:sz w:val="18"/>
-              </w:rPr>
-              <w:t>time control, phase</w:t>
-            </w:r>
-          </w:p>
-        </w:tc>
-      </w:tr>
-      <w:tr>
-        <w:trPr>
-          <w:cantSplit/>
-        </w:trPr>
-        <w:tc>
-          <w:tcPr>
-            <w:tcW w:type="dxa" w:w="1296"/>
-          </w:tcPr>
-          <w:p>
-            <w:pPr>
-              <w:keepNext w:val="0"/>
-              <w:spacing w:after="0" w:before="0"/>
-            </w:pPr>
-            <w:r/>
-            <w:r>
-              <w:rPr>
-                <w:sz w:val="18"/>
-              </w:rPr>
-              <w:t>GRP</w:t>
-            </w:r>
-          </w:p>
-        </w:tc>
-        <w:tc>
-          <w:tcPr>
-            <w:tcW w:type="dxa" w:w="4608"/>
-          </w:tcPr>
-          <w:p>
-            <w:pPr>
-              <w:keepNext w:val="0"/>
-              <w:spacing w:after="0" w:before="0"/>
-            </w:pPr>
-            <w:r/>
-            <w:r>
-              <w:rPr>
-                <w:sz w:val="18"/>
-              </w:rPr>
-              <w:t>S (superforecaster) or P (public)</w:t>
-            </w:r>
-          </w:p>
-        </w:tc>
-        <w:tc>
-          <w:tcPr>
-            <w:tcW w:type="dxa" w:w="3456"/>
-          </w:tcPr>
-          <w:p>
-            <w:pPr>
-              <w:keepNext w:val="0"/>
-              <w:spacing w:after="0" w:before="0"/>
-            </w:pPr>
-            <w:r/>
-            <w:r>
-              <w:rPr>
-                <w:sz w:val="18"/>
-              </w:rPr>
-              <w:t>Elo band</w:t>
-            </w:r>
-          </w:p>
-        </w:tc>
-      </w:tr>
-    </w:tbl>
-    <w:p>
-      <w:pPr>
-        <w:spacing w:after="40" w:line="120" w:lineRule="exact"/>
-      </w:pPr>
-    </w:p>
-    <w:p>
-      <w:pPr>
         <w:spacing w:after="120"/>
       </w:pPr>
       <w:r>
@@ -1016,12 +336,692 @@
     <w:p>
       <w:pPr>
         <w:keepNext/>
+        <w:spacing w:after="40"/>
+      </w:pPr>
+      <w:r>
+        <w:rPr>
+          <w:b/>
+          <w:sz w:val="20"/>
+        </w:rPr>
+        <w:t>Table 1. Row-level quantities and their chess counterparts.</w:t>
+      </w:r>
+    </w:p>
+    <w:tbl>
+      <w:tblPr>
+        <w:tblStyle w:val="TableGrid"/>
+        <w:tblW w:type="auto" w:w="0"/>
+        <w:jc w:val="center"/>
+        <w:tblLook w:firstColumn="1" w:firstRow="1" w:lastColumn="0" w:lastRow="0" w:noHBand="0" w:noVBand="1" w:val="04A0"/>
+      </w:tblPr>
+      <w:tblGrid>
+        <w:gridCol w:w="3120"/>
+        <w:gridCol w:w="3120"/>
+        <w:gridCol w:w="3120"/>
+      </w:tblGrid>
+      <w:tr>
+        <w:trPr>
+          <w:cantSplit/>
+        </w:trPr>
+        <w:tc>
+          <w:tcPr>
+            <w:tcW w:type="dxa" w:w="1296"/>
+          </w:tcPr>
+          <w:p>
+            <w:pPr>
+              <w:keepNext/>
+            </w:pPr>
+            <w:r/>
+            <w:r>
+              <w:rPr>
+                <w:b/>
+                <w:sz w:val="17"/>
+              </w:rPr>
+              <w:t>Symbol</w:t>
+            </w:r>
+          </w:p>
+        </w:tc>
+        <w:tc>
+          <w:tcPr>
+            <w:tcW w:type="dxa" w:w="4752"/>
+          </w:tcPr>
+          <w:p>
+            <w:pPr>
+              <w:keepNext/>
+            </w:pPr>
+            <w:r/>
+            <w:r>
+              <w:rPr>
+                <w:b/>
+                <w:sz w:val="17"/>
+              </w:rPr>
+              <w:t>Definition</w:t>
+            </w:r>
+          </w:p>
+        </w:tc>
+        <w:tc>
+          <w:tcPr>
+            <w:tcW w:type="dxa" w:w="3312"/>
+          </w:tcPr>
+          <w:p>
+            <w:pPr>
+              <w:keepNext/>
+            </w:pPr>
+            <w:r/>
+            <w:r>
+              <w:rPr>
+                <w:b/>
+                <w:sz w:val="17"/>
+              </w:rPr>
+              <w:t>Chess counterpart (Sun, 2026)</w:t>
+            </w:r>
+          </w:p>
+        </w:tc>
+      </w:tr>
+      <w:tr>
+        <w:trPr>
+          <w:cantSplit/>
+        </w:trPr>
+        <w:tc>
+          <w:tcPr>
+            <w:tcW w:type="dxa" w:w="1296"/>
+          </w:tcPr>
+          <w:p>
+            <w:pPr>
+              <w:keepNext/>
+              <w:spacing w:after="0" w:before="0"/>
+            </w:pPr>
+            <w:r/>
+            <w:r>
+              <w:rPr>
+                <w:sz w:val="17"/>
+              </w:rPr>
+              <w:t>p_h</w:t>
+            </w:r>
+          </w:p>
+        </w:tc>
+        <w:tc>
+          <w:tcPr>
+            <w:tcW w:type="dxa" w:w="4752"/>
+          </w:tcPr>
+          <w:p>
+            <w:pPr>
+              <w:keepNext/>
+              <w:spacing w:after="0" w:before="0"/>
+            </w:pPr>
+            <w:r/>
+            <w:r>
+              <w:rPr>
+                <w:sz w:val="17"/>
+              </w:rPr>
+              <w:t>the human's forecast</w:t>
+            </w:r>
+          </w:p>
+        </w:tc>
+        <w:tc>
+          <w:tcPr>
+            <w:tcW w:type="dxa" w:w="3312"/>
+          </w:tcPr>
+          <w:p>
+            <w:pPr>
+              <w:keepNext/>
+              <w:spacing w:after="0" w:before="0"/>
+            </w:pPr>
+            <w:r/>
+            <w:r>
+              <w:rPr>
+                <w:sz w:val="17"/>
+              </w:rPr>
+              <w:t>the move played</w:t>
+            </w:r>
+          </w:p>
+        </w:tc>
+      </w:tr>
+      <w:tr>
+        <w:trPr>
+          <w:cantSplit/>
+        </w:trPr>
+        <w:tc>
+          <w:tcPr>
+            <w:tcW w:type="dxa" w:w="1296"/>
+          </w:tcPr>
+          <w:p>
+            <w:pPr>
+              <w:keepNext/>
+              <w:spacing w:after="0" w:before="0"/>
+            </w:pPr>
+            <w:r/>
+            <w:r>
+              <w:rPr>
+                <w:sz w:val="17"/>
+              </w:rPr>
+              <w:t>p_a</w:t>
+            </w:r>
+          </w:p>
+        </w:tc>
+        <w:tc>
+          <w:tcPr>
+            <w:tcW w:type="dxa" w:w="4752"/>
+          </w:tcPr>
+          <w:p>
+            <w:pPr>
+              <w:keepNext/>
+              <w:spacing w:after="0" w:before="0"/>
+            </w:pPr>
+            <w:r/>
+            <w:r>
+              <w:rPr>
+                <w:sz w:val="17"/>
+              </w:rPr>
+              <w:t>benchmark (a) forecast, single best model</w:t>
+            </w:r>
+          </w:p>
+        </w:tc>
+        <w:tc>
+          <w:tcPr>
+            <w:tcW w:type="dxa" w:w="3312"/>
+          </w:tcPr>
+          <w:p>
+            <w:pPr>
+              <w:keepNext/>
+              <w:spacing w:after="0" w:before="0"/>
+            </w:pPr>
+            <w:r/>
+            <w:r>
+              <w:rPr>
+                <w:sz w:val="17"/>
+              </w:rPr>
+              <w:t>engine first choice</w:t>
+            </w:r>
+          </w:p>
+        </w:tc>
+      </w:tr>
+      <w:tr>
+        <w:trPr>
+          <w:cantSplit/>
+        </w:trPr>
+        <w:tc>
+          <w:tcPr>
+            <w:tcW w:type="dxa" w:w="1296"/>
+          </w:tcPr>
+          <w:p>
+            <w:pPr>
+              <w:keepNext/>
+              <w:spacing w:after="0" w:before="0"/>
+            </w:pPr>
+            <w:r/>
+            <w:r>
+              <w:rPr>
+                <w:sz w:val="17"/>
+              </w:rPr>
+              <w:t>o</w:t>
+            </w:r>
+          </w:p>
+        </w:tc>
+        <w:tc>
+          <w:tcPr>
+            <w:tcW w:type="dxa" w:w="4752"/>
+          </w:tcPr>
+          <w:p>
+            <w:pPr>
+              <w:keepNext/>
+              <w:spacing w:after="0" w:before="0"/>
+            </w:pPr>
+            <w:r/>
+            <w:r>
+              <w:rPr>
+                <w:sz w:val="17"/>
+              </w:rPr>
+              <w:t>outcome, 0 or 1</w:t>
+            </w:r>
+          </w:p>
+        </w:tc>
+        <w:tc>
+          <w:tcPr>
+            <w:tcW w:type="dxa" w:w="3312"/>
+          </w:tcPr>
+          <w:p>
+            <w:pPr>
+              <w:keepNext/>
+              <w:spacing w:after="0" w:before="0"/>
+            </w:pPr>
+            <w:r/>
+            <w:r>
+              <w:rPr>
+                <w:sz w:val="17"/>
+              </w:rPr>
+              <w:t>game result</w:t>
+            </w:r>
+          </w:p>
+        </w:tc>
+      </w:tr>
+      <w:tr>
+        <w:trPr>
+          <w:cantSplit/>
+        </w:trPr>
+        <w:tc>
+          <w:tcPr>
+            <w:tcW w:type="dxa" w:w="1296"/>
+          </w:tcPr>
+          <w:p>
+            <w:pPr>
+              <w:keepNext/>
+              <w:spacing w:after="0" w:before="0"/>
+            </w:pPr>
+            <w:r/>
+            <w:r>
+              <w:rPr>
+                <w:sz w:val="17"/>
+              </w:rPr>
+              <w:t>G_a</w:t>
+            </w:r>
+          </w:p>
+        </w:tc>
+        <w:tc>
+          <w:tcPr>
+            <w:tcW w:type="dxa" w:w="4752"/>
+          </w:tcPr>
+          <w:p>
+            <w:pPr>
+              <w:keepNext/>
+              <w:spacing w:after="0" w:before="0"/>
+            </w:pPr>
+            <w:r/>
+            <w:r>
+              <w:rPr>
+                <w:sz w:val="17"/>
+              </w:rPr>
+              <w:t>BS(p_a) − BS(p_h); positive = human beat the model on this target</w:t>
+            </w:r>
+          </w:p>
+        </w:tc>
+        <w:tc>
+          <w:tcPr>
+            <w:tcW w:type="dxa" w:w="3312"/>
+          </w:tcPr>
+          <w:p>
+            <w:pPr>
+              <w:keepNext/>
+              <w:spacing w:after="0" w:before="0"/>
+            </w:pPr>
+            <w:r/>
+            <w:r>
+              <w:rPr>
+                <w:sz w:val="17"/>
+              </w:rPr>
+              <w:t>net gain of the deviation in win probability</w:t>
+            </w:r>
+          </w:p>
+        </w:tc>
+      </w:tr>
+      <w:tr>
+        <w:trPr>
+          <w:cantSplit/>
+        </w:trPr>
+        <w:tc>
+          <w:tcPr>
+            <w:tcW w:type="dxa" w:w="1296"/>
+          </w:tcPr>
+          <w:p>
+            <w:pPr>
+              <w:keepNext/>
+              <w:spacing w:after="0" w:before="0"/>
+            </w:pPr>
+            <w:r/>
+            <w:r>
+              <w:rPr>
+                <w:sz w:val="17"/>
+              </w:rPr>
+              <w:t>D_a, absD_a</w:t>
+            </w:r>
+          </w:p>
+        </w:tc>
+        <w:tc>
+          <w:tcPr>
+            <w:tcW w:type="dxa" w:w="4752"/>
+          </w:tcPr>
+          <w:p>
+            <w:pPr>
+              <w:keepNext/>
+              <w:spacing w:after="0" w:before="0"/>
+            </w:pPr>
+            <w:r/>
+            <w:r>
+              <w:rPr>
+                <w:sz w:val="17"/>
+              </w:rPr>
+              <w:t>p_h − p_a and its absolute value</w:t>
+            </w:r>
+          </w:p>
+        </w:tc>
+        <w:tc>
+          <w:tcPr>
+            <w:tcW w:type="dxa" w:w="3312"/>
+          </w:tcPr>
+          <w:p>
+            <w:pPr>
+              <w:keepNext/>
+              <w:spacing w:after="0" w:before="0"/>
+            </w:pPr>
+            <w:r/>
+            <w:r>
+              <w:rPr>
+                <w:sz w:val="17"/>
+              </w:rPr>
+              <w:t>evaluation gap between played and best move</w:t>
+            </w:r>
+          </w:p>
+        </w:tc>
+      </w:tr>
+      <w:tr>
+        <w:trPr>
+          <w:cantSplit/>
+        </w:trPr>
+        <w:tc>
+          <w:tcPr>
+            <w:tcW w:type="dxa" w:w="1296"/>
+          </w:tcPr>
+          <w:p>
+            <w:pPr>
+              <w:keepNext/>
+              <w:spacing w:after="0" w:before="0"/>
+            </w:pPr>
+            <w:r/>
+            <w:r>
+              <w:rPr>
+                <w:sz w:val="17"/>
+              </w:rPr>
+              <w:t>EXT_a</w:t>
+            </w:r>
+          </w:p>
+        </w:tc>
+        <w:tc>
+          <w:tcPr>
+            <w:tcW w:type="dxa" w:w="4752"/>
+          </w:tcPr>
+          <w:p>
+            <w:pPr>
+              <w:keepNext/>
+              <w:spacing w:after="0" w:before="0"/>
+            </w:pPr>
+            <w:r/>
+            <w:r>
+              <w:rPr>
+                <w:sz w:val="17"/>
+              </w:rPr>
+              <w:t>|p_h − 0.5| − |p_a − 0.5|; positive = human more extreme than the model</w:t>
+            </w:r>
+          </w:p>
+        </w:tc>
+        <w:tc>
+          <w:tcPr>
+            <w:tcW w:type="dxa" w:w="3312"/>
+          </w:tcPr>
+          <w:p>
+            <w:pPr>
+              <w:keepNext/>
+              <w:spacing w:after="0" w:before="0"/>
+            </w:pPr>
+            <w:r/>
+            <w:r>
+              <w:rPr>
+                <w:sz w:val="17"/>
+              </w:rPr>
+              <w:t>sharpness (punishment-curve steepness) of the played move</w:t>
+            </w:r>
+          </w:p>
+        </w:tc>
+      </w:tr>
+      <w:tr>
+        <w:trPr>
+          <w:cantSplit/>
+        </w:trPr>
+        <w:tc>
+          <w:tcPr>
+            <w:tcW w:type="dxa" w:w="1296"/>
+          </w:tcPr>
+          <w:p>
+            <w:pPr>
+              <w:keepNext/>
+              <w:spacing w:after="0" w:before="0"/>
+            </w:pPr>
+            <w:r/>
+            <w:r>
+              <w:rPr>
+                <w:sz w:val="17"/>
+              </w:rPr>
+              <w:t>DIS</w:t>
+            </w:r>
+          </w:p>
+        </w:tc>
+        <w:tc>
+          <w:tcPr>
+            <w:tcW w:type="dxa" w:w="4752"/>
+          </w:tcPr>
+          <w:p>
+            <w:pPr>
+              <w:keepNext/>
+              <w:spacing w:after="0" w:before="0"/>
+            </w:pPr>
+            <w:r/>
+            <w:r>
+              <w:rPr>
+                <w:sz w:val="17"/>
+              </w:rPr>
+              <w:t>cross-model disagreement: mean of two within-scaffold SDs across the 17 base models</w:t>
+            </w:r>
+          </w:p>
+        </w:tc>
+        <w:tc>
+          <w:tcPr>
+            <w:tcW w:type="dxa" w:w="3312"/>
+          </w:tcPr>
+          <w:p>
+            <w:pPr>
+              <w:keepNext/>
+              <w:spacing w:after="0" w:before="0"/>
+            </w:pPr>
+            <w:r/>
+            <w:r>
+              <w:rPr>
+                <w:sz w:val="17"/>
+              </w:rPr>
+              <w:t>engine line spread</w:t>
+            </w:r>
+          </w:p>
+        </w:tc>
+      </w:tr>
+      <w:tr>
+        <w:trPr>
+          <w:cantSplit/>
+        </w:trPr>
+        <w:tc>
+          <w:tcPr>
+            <w:tcW w:type="dxa" w:w="1296"/>
+          </w:tcPr>
+          <w:p>
+            <w:pPr>
+              <w:keepNext/>
+              <w:spacing w:after="0" w:before="0"/>
+            </w:pPr>
+            <w:r/>
+            <w:r>
+              <w:rPr>
+                <w:sz w:val="17"/>
+              </w:rPr>
+              <w:t>CONF_a</w:t>
+            </w:r>
+          </w:p>
+        </w:tc>
+        <w:tc>
+          <w:tcPr>
+            <w:tcW w:type="dxa" w:w="4752"/>
+          </w:tcPr>
+          <w:p>
+            <w:pPr>
+              <w:keepNext/>
+              <w:spacing w:after="0" w:before="0"/>
+            </w:pPr>
+            <w:r/>
+            <w:r>
+              <w:rPr>
+                <w:sz w:val="17"/>
+              </w:rPr>
+              <w:t>|p_a − 0.5|, the model's own confidence</w:t>
+            </w:r>
+          </w:p>
+        </w:tc>
+        <w:tc>
+          <w:tcPr>
+            <w:tcW w:type="dxa" w:w="3312"/>
+          </w:tcPr>
+          <w:p>
+            <w:pPr>
+              <w:keepNext/>
+              <w:spacing w:after="0" w:before="0"/>
+            </w:pPr>
+            <w:r/>
+            <w:r>
+              <w:rPr>
+                <w:sz w:val="17"/>
+              </w:rPr>
+              <w:t>engine evaluation margin</w:t>
+            </w:r>
+          </w:p>
+        </w:tc>
+      </w:tr>
+      <w:tr>
+        <w:trPr>
+          <w:cantSplit/>
+        </w:trPr>
+        <w:tc>
+          <w:tcPr>
+            <w:tcW w:type="dxa" w:w="1296"/>
+          </w:tcPr>
+          <w:p>
+            <w:pPr>
+              <w:keepNext/>
+              <w:spacing w:after="0" w:before="0"/>
+            </w:pPr>
+            <w:r/>
+            <w:r>
+              <w:rPr>
+                <w:sz w:val="17"/>
+              </w:rPr>
+              <w:t>HZ, MKT, SRC</w:t>
+            </w:r>
+          </w:p>
+        </w:tc>
+        <w:tc>
+          <w:tcPr>
+            <w:tcW w:type="dxa" w:w="4752"/>
+          </w:tcPr>
+          <w:p>
+            <w:pPr>
+              <w:keepNext/>
+              <w:spacing w:after="0" w:before="0"/>
+            </w:pPr>
+            <w:r/>
+            <w:r>
+              <w:rPr>
+                <w:sz w:val="17"/>
+              </w:rPr>
+              <w:t>horizon in days (log), market indicator, question source</w:t>
+            </w:r>
+          </w:p>
+        </w:tc>
+        <w:tc>
+          <w:tcPr>
+            <w:tcW w:type="dxa" w:w="3312"/>
+          </w:tcPr>
+          <w:p>
+            <w:pPr>
+              <w:keepNext/>
+              <w:spacing w:after="0" w:before="0"/>
+            </w:pPr>
+            <w:r/>
+            <w:r>
+              <w:rPr>
+                <w:sz w:val="17"/>
+              </w:rPr>
+              <w:t>time control, phase</w:t>
+            </w:r>
+          </w:p>
+        </w:tc>
+      </w:tr>
+      <w:tr>
+        <w:trPr>
+          <w:cantSplit/>
+        </w:trPr>
+        <w:tc>
+          <w:tcPr>
+            <w:tcW w:type="dxa" w:w="1296"/>
+          </w:tcPr>
+          <w:p>
+            <w:pPr>
+              <w:keepNext w:val="0"/>
+              <w:spacing w:after="0" w:before="0"/>
+            </w:pPr>
+            <w:r/>
+            <w:r>
+              <w:rPr>
+                <w:sz w:val="17"/>
+              </w:rPr>
+              <w:t>GRP</w:t>
+            </w:r>
+          </w:p>
+        </w:tc>
+        <w:tc>
+          <w:tcPr>
+            <w:tcW w:type="dxa" w:w="4752"/>
+          </w:tcPr>
+          <w:p>
+            <w:pPr>
+              <w:keepNext w:val="0"/>
+              <w:spacing w:after="0" w:before="0"/>
+            </w:pPr>
+            <w:r/>
+            <w:r>
+              <w:rPr>
+                <w:sz w:val="17"/>
+              </w:rPr>
+              <w:t>S (superforecaster) or P (public)</w:t>
+            </w:r>
+          </w:p>
+        </w:tc>
+        <w:tc>
+          <w:tcPr>
+            <w:tcW w:type="dxa" w:w="3312"/>
+          </w:tcPr>
+          <w:p>
+            <w:pPr>
+              <w:keepNext w:val="0"/>
+              <w:spacing w:after="0" w:before="0"/>
+            </w:pPr>
+            <w:r/>
+            <w:r>
+              <w:rPr>
+                <w:sz w:val="17"/>
+              </w:rPr>
+              <w:t>Elo band</w:t>
+            </w:r>
+          </w:p>
+        </w:tc>
+      </w:tr>
+    </w:tbl>
+    <w:p>
+      <w:pPr>
+        <w:spacing w:after="40" w:line="120" w:lineRule="exact"/>
+      </w:pPr>
+    </w:p>
+    <w:p>
+      <w:pPr>
+        <w:keepNext/>
         <w:jc w:val="center"/>
       </w:pPr>
       <w:r>
         <w:drawing>
           <wp:inline xmlns:a="http://schemas.openxmlformats.org/drawingml/2006/main" xmlns:pic="http://schemas.openxmlformats.org/drawingml/2006/picture">
-            <wp:extent cx="5486400" cy="3740727"/>
+            <wp:extent cx="4754880" cy="3241964"/>
             <wp:docPr id="1" name="Picture 1"/>
             <wp:cNvGraphicFramePr>
               <a:graphicFrameLocks noChangeAspect="1"/>
@@ -1042,7 +1042,7 @@
                   <pic:spPr>
                     <a:xfrm>
                       <a:off x="0" y="0"/>
-                      <a:ext cx="5486400" cy="3740727"/>
+                      <a:ext cx="4754880" cy="3241964"/>
                     </a:xfrm>
                     <a:prstGeom prst="rect"/>
                   </pic:spPr>
@@ -1919,7 +1919,7 @@
           <w:b w:val="0"/>
           <w:i w:val="0"/>
         </w:rPr>
-        <w:t>This is the point at which the forecasting domain parts from chess. In chess, the human deviation carried nothing the engine lacked: the opponent's error beyond difficulty did not rise with the deviation's character, and the deviation cost on average. Here a public forecaster who lost to the model on average still contributed, in aggregate, something the model did not have. Losing on average and carrying information are compatible. The public forecasts are noisier than the model's and the noise costs Brier points, but the signal inside them is not already in the model.</w:t>
+        <w:t>This is the point at which the forecasting domain parts from chess. In chess, the human deviation carried nothing the engine lacked: the opponent's error beyond difficulty did not rise with the deviation's character, and the deviation cost on average. Here a public forecaster who lost to the model on average still contributed, in aggregate, something the model did not have. Losing on average and carrying information are compatible. The public forecasts are noisier than the model's and the noise costs Brier points, but the signal inside them is not already in the model. Section 6 asks the harder question of whether that signal is already in the other models.</w:t>
       </w:r>
     </w:p>
     <w:p>
@@ -2021,7 +2021,7 @@
           <w:b w:val="0"/>
           <w:i w:val="0"/>
         </w:rPr>
-        <w:t>A post-hoc diagnostic, specified after these results were seen and carrying no inferential claim, shows where the two rules disagree (Section 6). It does not decide between them. The primary H4 remains the Brier fit because the specification named it, and I report the log-score sign beside it as a limitation on the finding rather than as a second finding.</w:t>
+        <w:t>A post-hoc diagnostic, specified after these results were seen and carrying no inferential claim, shows where the two rules disagree (Section 7). It does not decide between them. The primary H4 remains the Brier fit because the specification named it, and I report the log-score sign beside it as a limitation on the finding rather than as a second finding.</w:t>
       </w:r>
     </w:p>
     <w:p>
@@ -2612,7 +2612,7 @@
           <w:b w:val="0"/>
           <w:i w:val="0"/>
         </w:rPr>
-        <w:t>The two domains differ on one thing, and the difference is consistent with the benchmark's fallibility being what decides it. In chess the human deviation carried no information the engine lacked. In forecasting it did, for both groups, including the group that lost to the model on average. Whether the human has anything to add is consistent with being set by whether the benchmark can err. Where it adds, and in which direction, is not settled by that, and the forecasting results give no simple answer to either. The two domains differ in more than the benchmark's fallibility, so this is a pattern across two cases, not a test of what produces it.</w:t>
+        <w:t>The two domains differ on one thing, and the difference is consistent with the benchmark's fallibility being what decides it. In chess the human deviation carried no information the engine lacked. In forecasting it did, relative to the single best model, for both groups, including the group that lost to the model on average. Section 6 narrows that: relative to an ensemble of the other models, only the superforecasters add something on a scale-free measure. The forecasting result that survives is relative to a single model; the chess study had no ensemble counterpart, so the two-case comparison is between single benchmarks. Whether the human has anything to add is consistent with being set by whether the benchmark can err. Where it adds, and in which direction, is not settled by that, and the forecasting results give no simple answer to either. The two domains differ in more than the benchmark's fallibility, so this is a pattern across two cases, not a test of what produces it.</w:t>
       </w:r>
     </w:p>
     <w:p>
@@ -2621,7 +2621,739 @@
         <w:keepNext/>
       </w:pPr>
       <w:r>
-        <w:t>6. A post-hoc diagnostic of the scoring-rule reversal</w:t>
+        <w:t>6. Varying the benchmark</w:t>
+      </w:r>
+    </w:p>
+    <w:p>
+      <w:pPr>
+        <w:spacing w:after="120"/>
+      </w:pPr>
+      <w:r>
+        <w:rPr>
+          <w:b w:val="0"/>
+          <w:i w:val="0"/>
+        </w:rPr>
+        <w:t>Sections 4 and 5 fix the benchmark at one model. The round has 34 model variants in the matched information condition, spanning a range of quality, and each can serve as the benchmark in turn. A second specification (SPEC v2) was locked and pushed to the same repository on 2026-09-08, before any of its analysis ran, to ask how the information the human median carries beyond a model changes with that model's quality. This section was added to the paper after the first version was published; the first version and its specification are unchanged in the repository.</w:t>
+      </w:r>
+    </w:p>
+    <w:p>
+      <w:pPr>
+        <w:pStyle w:val="Heading2"/>
+        <w:keepNext/>
+      </w:pPr>
+      <w:r>
+        <w:t>6.1 Design</w:t>
+      </w:r>
+    </w:p>
+    <w:p>
+      <w:pPr>
+        <w:spacing w:after="120"/>
+      </w:pPr>
+      <w:r>
+        <w:rPr>
+          <w:b w:val="0"/>
+          <w:i w:val="0"/>
+        </w:rPr>
+        <w:t>For each variant m, Q_m is its mean Brier score on the v1 selection set, the single-question targets that no human forecast, so quality is measured out of sample relative to the test set. Q spans 0.1616 to 0.3974, but unevenly: 32 of 34 variants lie between 0.1616 and 0.2642 and the top two sit apart at 0.2841 and 0.3974. Two quantities are computed per variant and per group with the v1 code paths: β_m, the encompassing coefficient of Section 4.2 with variant m as the model, and ε_m, the extremization coefficient of Section 4.4 with variant m as the model. The mean gain over variant m is also tabulated but not plotted, because it is close to an identity: it is the variant's Brier score minus the group's, and the second term does not vary with m.</w:t>
+      </w:r>
+    </w:p>
+    <w:p>
+      <w:pPr>
+        <w:spacing w:after="120"/>
+      </w:pPr>
+      <w:r>
+        <w:rPr>
+          <w:b w:val="0"/>
+          <w:i w:val="0"/>
+        </w:rPr>
+        <w:t>Three hypotheses were locked. H6: the slope of β on Q, expected positive because a worse model leaves more for the human to add, two-sided. H7: the slope of ε on Q, no direction. H8, descriptive: whether the human median disagrees with all models in the same places. The 34 points are not independent observations. Every β and ε rests on the same 578 targets, the same human medians, and the same outcomes, so outcome noise is shared across all 34, and clustering on the 17 base models cannot remove that sharing. The primary interval is therefore a question-level cluster bootstrap: resample the 162 questions, recompute every β for all 34 variants, refit the slope, 2,000 draws. The analytic interval clustered by base model is reported beside it and is much narrower. A leverage rule (leverage above 2p/n or Cook's distance above 4/n) was fixed after the pilot and before the full run, with a co-primary refit on unflagged points; an H6 or H7 conclusion stands only if the slope keeps its sign without the flagged points. Two robustness items address the scale of β: a scale-free version of H6 replaces β with the out-of-sample improvement in mean log score from adding the human term, cross-fitted in five folds by question, and H7 is rerun under the log score.</w:t>
+      </w:r>
+    </w:p>
+    <w:p>
+      <w:pPr>
+        <w:pStyle w:val="Heading2"/>
+        <w:keepNext/>
+      </w:pPr>
+      <w:r>
+        <w:t>6.2 Pre-registered results</w:t>
+      </w:r>
+    </w:p>
+    <w:p>
+      <w:pPr>
+        <w:spacing w:after="120"/>
+      </w:pPr>
+      <w:r>
+        <w:rPr>
+          <w:b w:val="0"/>
+          <w:i w:val="0"/>
+        </w:rPr>
+        <w:t>β is positive on every variant for both groups: 1.49 to 1.94 for the superforecaster median and 0.71 to 1.78 for the public median. The fitted line does not reach zero anywhere in the observed range of Q for either group, and 100% of bootstrap draws put the crossing outside the range, so no extrapolation is made. Since β is positive at the best model (Section 4.2) and the slope is not negative, this is the expected consequence of those two facts and not a separate finding. What it says is that within this generation of models, the information the human median adds shows no sign of vanishing as the model improves.</w:t>
+      </w:r>
+    </w:p>
+    <w:p>
+      <w:pPr>
+        <w:spacing w:after="120"/>
+      </w:pPr>
+      <w:r>
+        <w:rPr>
+          <w:b w:val="0"/>
+          <w:i w:val="0"/>
+        </w:rPr>
+        <w:t>The H6 slope for the superforecaster median is +0.47 (bootstrap 95% CI −0.57 to 1.50) on all points and −0.62 with four flagged points removed. The sign does not survive, so under the locked rule no directional claim is made. For the public median the slope is +3.13 (2.06 to 4.54) on all points and +4.48 (2.78 to 6.47) with two flagged points removed, so the sign survives. On the scale-free measure the slope is +1.10 (0.82 to 1.42) for superforecasters and +1.01 (0.71 to 1.32) for the public, both agreeing in sign with the β slope. The single highest-Q variant, GPT-3.5-Turbo zero-shot, carries leverage of 0.56 to 0.75 in every fit and a Cook's distance of 4.09 in the public β fit; the slopes are largely a contrast between a dense cluster and that point.</w:t>
+      </w:r>
+    </w:p>
+    <w:p>
+      <w:pPr>
+        <w:spacing w:after="120"/>
+      </w:pPr>
+      <w:r>
+        <w:rPr>
+          <w:b w:val="0"/>
+          <w:i w:val="0"/>
+        </w:rPr>
+        <w:t>H7 is descriptive only. The fast inner-loop estimator required for a valid bootstrap (question-clustered OLS with forecaster fixed effects) differed from the mixed-model point estimates by up to 0.059, against an across-variant spread of ε of 0.023, and the amendment that introduced it had ruled that a discrepancy of that size demotes H7 to a figure without an interval. The descriptive slopes are +0.02 (superforecasters) and −0.17 (public), the first not surviving the leverage refit. H8 gives a mean pairwise correlation across variants of the human-minus-model term of 0.77 for the superforecaster median and 0.34 for the public median, against a reference correlation of 0.56 among the model forecasts themselves. The two groups straddle the reference in opposite directions, which is what a shared-component artifact looks like, and no conclusion is drawn from it.</w:t>
+      </w:r>
+    </w:p>
+    <w:p>
+      <w:pPr>
+        <w:pStyle w:val="Heading2"/>
+        <w:keepNext/>
+      </w:pPr>
+      <w:r>
+        <w:t>6.3 A reference curve</w:t>
+      </w:r>
+    </w:p>
+    <w:p>
+      <w:pPr>
+        <w:spacing w:after="120"/>
+      </w:pPr>
+      <w:r>
+        <w:rPr>
+          <w:b w:val="0"/>
+          <w:i w:val="0"/>
+        </w:rPr>
+        <w:t>The H6 slope has a problem that the pre-registered design did not address. Any predictor that is not pure noise improves more on a worse model, so a positive slope is close to mechanical and does not by itself show that the human adds anything a second model would not. A post-results amendment (SPEC v2 Amendment 2) added a reference curve: for each variant m, the human median is replaced by the median of the other 33 variants on that target, and both y quantities are recomputed with the same folds, seed, clipping, and target sets. The reading was locked in advance: the claim that the human carries information the models do not is supported only where the human curve lies above the reference curve. The difference is computed inside each bootstrap draw so the interval is paired. This is a diagnostic added after the results were seen; it refit no pre-registered estimate.</w:t>
+      </w:r>
+    </w:p>
+    <w:p>
+      <w:pPr>
+        <w:keepNext/>
+        <w:jc w:val="center"/>
+      </w:pPr>
+      <w:r>
+        <w:drawing>
+          <wp:inline xmlns:a="http://schemas.openxmlformats.org/drawingml/2006/main" xmlns:pic="http://schemas.openxmlformats.org/drawingml/2006/picture">
+            <wp:extent cx="5852160" cy="2340864"/>
+            <wp:docPr id="3" name="Picture 3"/>
+            <wp:cNvGraphicFramePr>
+              <a:graphicFrameLocks noChangeAspect="1"/>
+            </wp:cNvGraphicFramePr>
+            <a:graphic>
+              <a:graphicData uri="http://schemas.openxmlformats.org/drawingml/2006/picture">
+                <pic:pic>
+                  <pic:nvPicPr>
+                    <pic:cNvPr id="0" name="v2_full_amd2_gain_ref.png"/>
+                    <pic:cNvPicPr/>
+                  </pic:nvPicPr>
+                  <pic:blipFill>
+                    <a:blip r:embed="rId11"/>
+                    <a:stretch>
+                      <a:fillRect/>
+                    </a:stretch>
+                  </pic:blipFill>
+                  <pic:spPr>
+                    <a:xfrm>
+                      <a:off x="0" y="0"/>
+                      <a:ext cx="5852160" cy="2340864"/>
+                    </a:xfrm>
+                    <a:prstGeom prst="rect"/>
+                  </pic:spPr>
+                </pic:pic>
+              </a:graphicData>
+            </a:graphic>
+          </wp:inline>
+        </w:drawing>
+      </w:r>
+    </w:p>
+    <w:p>
+      <w:pPr>
+        <w:spacing w:after="200"/>
+      </w:pPr>
+      <w:r>
+        <w:rPr>
+          <w:b/>
+          <w:sz w:val="20"/>
+        </w:rPr>
+        <w:t xml:space="preserve">Figure 3. </w:t>
+      </w:r>
+      <w:r>
+        <w:rPr>
+          <w:i/>
+          <w:sz w:val="20"/>
+        </w:rPr>
+        <w:t>Cross-fitted out-of-sample log-score gain from adding the human median (circles, solid line) or the median of the other 33 model variants (triangles, dashed line) to each of 34 benchmark models, against the benchmark's quality Q. Left: superforecaster median. Right: public median. Vertical dotted lines mark the minimum, median, and maximum Q at which the paired differences in Table 4 are evaluated.</w:t>
+      </w:r>
+    </w:p>
+    <w:p>
+      <w:pPr>
+        <w:keepNext/>
+        <w:spacing w:after="40"/>
+      </w:pPr>
+      <w:r>
+        <w:rPr>
+          <w:b/>
+          <w:sz w:val="20"/>
+        </w:rPr>
+        <w:t>Table 4. Human minus reference, evaluated at three points on Q. Paired question-level bootstrap, 2,000 draws, 95% intervals. Positive = the human median adds more than the median of the other 33 models.</w:t>
+      </w:r>
+    </w:p>
+    <w:tbl>
+      <w:tblPr>
+        <w:tblStyle w:val="TableGrid"/>
+        <w:tblW w:type="auto" w:w="0"/>
+        <w:jc w:val="center"/>
+        <w:tblLook w:firstColumn="1" w:firstRow="1" w:lastColumn="0" w:lastRow="0" w:noHBand="0" w:noVBand="1" w:val="04A0"/>
+      </w:tblPr>
+      <w:tblGrid>
+        <w:gridCol w:w="1872"/>
+        <w:gridCol w:w="1872"/>
+        <w:gridCol w:w="1872"/>
+        <w:gridCol w:w="1872"/>
+        <w:gridCol w:w="1872"/>
+      </w:tblGrid>
+      <w:tr>
+        <w:trPr>
+          <w:cantSplit/>
+        </w:trPr>
+        <w:tc>
+          <w:tcPr>
+            <w:tcW w:type="dxa" w:w="2016"/>
+          </w:tcPr>
+          <w:p>
+            <w:pPr>
+              <w:keepNext/>
+            </w:pPr>
+            <w:r/>
+            <w:r>
+              <w:rPr>
+                <w:b/>
+                <w:sz w:val="19"/>
+              </w:rPr>
+              <w:t>Quantity</w:t>
+            </w:r>
+          </w:p>
+        </w:tc>
+        <w:tc>
+          <w:tcPr>
+            <w:tcW w:type="dxa" w:w="864"/>
+          </w:tcPr>
+          <w:p>
+            <w:pPr>
+              <w:keepNext/>
+            </w:pPr>
+            <w:r/>
+            <w:r>
+              <w:rPr>
+                <w:b/>
+                <w:sz w:val="19"/>
+              </w:rPr>
+              <w:t>Group</w:t>
+            </w:r>
+          </w:p>
+        </w:tc>
+        <w:tc>
+          <w:tcPr>
+            <w:tcW w:type="dxa" w:w="2160"/>
+          </w:tcPr>
+          <w:p>
+            <w:pPr>
+              <w:keepNext/>
+            </w:pPr>
+            <w:r/>
+            <w:r>
+              <w:rPr>
+                <w:b/>
+                <w:sz w:val="19"/>
+              </w:rPr>
+              <w:t>At min Q (0.16)</w:t>
+            </w:r>
+          </w:p>
+        </w:tc>
+        <w:tc>
+          <w:tcPr>
+            <w:tcW w:type="dxa" w:w="2160"/>
+          </w:tcPr>
+          <w:p>
+            <w:pPr>
+              <w:keepNext/>
+            </w:pPr>
+            <w:r/>
+            <w:r>
+              <w:rPr>
+                <w:b/>
+                <w:sz w:val="19"/>
+              </w:rPr>
+              <w:t>At median Q (0.20)</w:t>
+            </w:r>
+          </w:p>
+        </w:tc>
+        <w:tc>
+          <w:tcPr>
+            <w:tcW w:type="dxa" w:w="2160"/>
+          </w:tcPr>
+          <w:p>
+            <w:pPr>
+              <w:keepNext/>
+            </w:pPr>
+            <w:r/>
+            <w:r>
+              <w:rPr>
+                <w:b/>
+                <w:sz w:val="19"/>
+              </w:rPr>
+              <w:t>At max Q (0.40)</w:t>
+            </w:r>
+          </w:p>
+        </w:tc>
+      </w:tr>
+      <w:tr>
+        <w:trPr>
+          <w:cantSplit/>
+        </w:trPr>
+        <w:tc>
+          <w:tcPr>
+            <w:tcW w:type="dxa" w:w="2016"/>
+          </w:tcPr>
+          <w:p>
+            <w:pPr>
+              <w:keepNext/>
+              <w:spacing w:after="0" w:before="0"/>
+            </w:pPr>
+            <w:r/>
+            <w:r>
+              <w:rPr>
+                <w:sz w:val="19"/>
+              </w:rPr>
+              <w:t>β (encompassing)</w:t>
+            </w:r>
+          </w:p>
+        </w:tc>
+        <w:tc>
+          <w:tcPr>
+            <w:tcW w:type="dxa" w:w="864"/>
+          </w:tcPr>
+          <w:p>
+            <w:pPr>
+              <w:keepNext/>
+              <w:spacing w:after="0" w:before="0"/>
+            </w:pPr>
+            <w:r/>
+            <w:r>
+              <w:rPr>
+                <w:sz w:val="19"/>
+              </w:rPr>
+              <w:t>S</w:t>
+            </w:r>
+          </w:p>
+        </w:tc>
+        <w:tc>
+          <w:tcPr>
+            <w:tcW w:type="dxa" w:w="2160"/>
+          </w:tcPr>
+          <w:p>
+            <w:pPr>
+              <w:keepNext/>
+              <w:spacing w:after="0" w:before="0"/>
+            </w:pPr>
+            <w:r/>
+            <w:r>
+              <w:rPr>
+                <w:sz w:val="19"/>
+              </w:rPr>
+              <w:t>−0.68 [−1.70, 0.37]</w:t>
+            </w:r>
+          </w:p>
+        </w:tc>
+        <w:tc>
+          <w:tcPr>
+            <w:tcW w:type="dxa" w:w="2160"/>
+          </w:tcPr>
+          <w:p>
+            <w:pPr>
+              <w:keepNext/>
+              <w:spacing w:after="0" w:before="0"/>
+            </w:pPr>
+            <w:r/>
+            <w:r>
+              <w:rPr>
+                <w:sz w:val="19"/>
+              </w:rPr>
+              <w:t>−0.88 [−1.86, 0.14]</w:t>
+            </w:r>
+          </w:p>
+        </w:tc>
+        <w:tc>
+          <w:tcPr>
+            <w:tcW w:type="dxa" w:w="2160"/>
+          </w:tcPr>
+          <w:p>
+            <w:pPr>
+              <w:keepNext/>
+              <w:spacing w:after="0" w:before="0"/>
+            </w:pPr>
+            <w:r/>
+            <w:r>
+              <w:rPr>
+                <w:sz w:val="19"/>
+              </w:rPr>
+              <w:t>−1.81 [−2.77, −0.87]</w:t>
+            </w:r>
+          </w:p>
+        </w:tc>
+      </w:tr>
+      <w:tr>
+        <w:trPr>
+          <w:cantSplit/>
+        </w:trPr>
+        <w:tc>
+          <w:tcPr>
+            <w:tcW w:type="dxa" w:w="2016"/>
+          </w:tcPr>
+          <w:p>
+            <w:pPr>
+              <w:keepNext/>
+              <w:spacing w:after="0" w:before="0"/>
+            </w:pPr>
+            <w:r/>
+            <w:r>
+              <w:rPr>
+                <w:sz w:val="19"/>
+              </w:rPr>
+              <w:t>β (encompassing)</w:t>
+            </w:r>
+          </w:p>
+        </w:tc>
+        <w:tc>
+          <w:tcPr>
+            <w:tcW w:type="dxa" w:w="864"/>
+          </w:tcPr>
+          <w:p>
+            <w:pPr>
+              <w:keepNext/>
+              <w:spacing w:after="0" w:before="0"/>
+            </w:pPr>
+            <w:r/>
+            <w:r>
+              <w:rPr>
+                <w:sz w:val="19"/>
+              </w:rPr>
+              <w:t>P</w:t>
+            </w:r>
+          </w:p>
+        </w:tc>
+        <w:tc>
+          <w:tcPr>
+            <w:tcW w:type="dxa" w:w="2160"/>
+          </w:tcPr>
+          <w:p>
+            <w:pPr>
+              <w:keepNext/>
+              <w:spacing w:after="0" w:before="0"/>
+            </w:pPr>
+            <w:r/>
+            <w:r>
+              <w:rPr>
+                <w:sz w:val="19"/>
+              </w:rPr>
+              <w:t>−1.08 [−2.17, −0.23]</w:t>
+            </w:r>
+          </w:p>
+        </w:tc>
+        <w:tc>
+          <w:tcPr>
+            <w:tcW w:type="dxa" w:w="2160"/>
+          </w:tcPr>
+          <w:p>
+            <w:pPr>
+              <w:keepNext/>
+              <w:spacing w:after="0" w:before="0"/>
+            </w:pPr>
+            <w:r/>
+            <w:r>
+              <w:rPr>
+                <w:sz w:val="19"/>
+              </w:rPr>
+              <w:t>−1.16 [−2.23, −0.35]</w:t>
+            </w:r>
+          </w:p>
+        </w:tc>
+        <w:tc>
+          <w:tcPr>
+            <w:tcW w:type="dxa" w:w="2160"/>
+          </w:tcPr>
+          <w:p>
+            <w:pPr>
+              <w:keepNext/>
+              <w:spacing w:after="0" w:before="0"/>
+            </w:pPr>
+            <w:r/>
+            <w:r>
+              <w:rPr>
+                <w:sz w:val="19"/>
+              </w:rPr>
+              <w:t>−1.59 [−2.62, −0.80]</w:t>
+            </w:r>
+          </w:p>
+        </w:tc>
+      </w:tr>
+      <w:tr>
+        <w:trPr>
+          <w:cantSplit/>
+        </w:trPr>
+        <w:tc>
+          <w:tcPr>
+            <w:tcW w:type="dxa" w:w="2016"/>
+          </w:tcPr>
+          <w:p>
+            <w:pPr>
+              <w:keepNext/>
+              <w:spacing w:after="0" w:before="0"/>
+            </w:pPr>
+            <w:r/>
+            <w:r>
+              <w:rPr>
+                <w:sz w:val="19"/>
+              </w:rPr>
+              <w:t>Log-score gain</w:t>
+            </w:r>
+          </w:p>
+        </w:tc>
+        <w:tc>
+          <w:tcPr>
+            <w:tcW w:type="dxa" w:w="864"/>
+          </w:tcPr>
+          <w:p>
+            <w:pPr>
+              <w:keepNext/>
+              <w:spacing w:after="0" w:before="0"/>
+            </w:pPr>
+            <w:r/>
+            <w:r>
+              <w:rPr>
+                <w:sz w:val="19"/>
+              </w:rPr>
+              <w:t>S</w:t>
+            </w:r>
+          </w:p>
+        </w:tc>
+        <w:tc>
+          <w:tcPr>
+            <w:tcW w:type="dxa" w:w="2160"/>
+          </w:tcPr>
+          <w:p>
+            <w:pPr>
+              <w:keepNext/>
+              <w:spacing w:after="0" w:before="0"/>
+            </w:pPr>
+            <w:r/>
+            <w:r>
+              <w:rPr>
+                <w:sz w:val="19"/>
+              </w:rPr>
+              <w:t>+0.106 [0.064, 0.150]</w:t>
+            </w:r>
+          </w:p>
+        </w:tc>
+        <w:tc>
+          <w:tcPr>
+            <w:tcW w:type="dxa" w:w="2160"/>
+          </w:tcPr>
+          <w:p>
+            <w:pPr>
+              <w:keepNext/>
+              <w:spacing w:after="0" w:before="0"/>
+            </w:pPr>
+            <w:r/>
+            <w:r>
+              <w:rPr>
+                <w:sz w:val="19"/>
+              </w:rPr>
+              <w:t>+0.101 [0.061, 0.146]</w:t>
+            </w:r>
+          </w:p>
+        </w:tc>
+        <w:tc>
+          <w:tcPr>
+            <w:tcW w:type="dxa" w:w="2160"/>
+          </w:tcPr>
+          <w:p>
+            <w:pPr>
+              <w:keepNext/>
+              <w:spacing w:after="0" w:before="0"/>
+            </w:pPr>
+            <w:r/>
+            <w:r>
+              <w:rPr>
+                <w:sz w:val="19"/>
+              </w:rPr>
+              <w:t>+0.079 [0.041, 0.140]</w:t>
+            </w:r>
+          </w:p>
+        </w:tc>
+      </w:tr>
+      <w:tr>
+        <w:trPr>
+          <w:cantSplit/>
+        </w:trPr>
+        <w:tc>
+          <w:tcPr>
+            <w:tcW w:type="dxa" w:w="2016"/>
+          </w:tcPr>
+          <w:p>
+            <w:pPr>
+              <w:keepNext w:val="0"/>
+              <w:spacing w:after="0" w:before="0"/>
+            </w:pPr>
+            <w:r/>
+            <w:r>
+              <w:rPr>
+                <w:sz w:val="19"/>
+              </w:rPr>
+              <w:t>Log-score gain</w:t>
+            </w:r>
+          </w:p>
+        </w:tc>
+        <w:tc>
+          <w:tcPr>
+            <w:tcW w:type="dxa" w:w="864"/>
+          </w:tcPr>
+          <w:p>
+            <w:pPr>
+              <w:keepNext w:val="0"/>
+              <w:spacing w:after="0" w:before="0"/>
+            </w:pPr>
+            <w:r/>
+            <w:r>
+              <w:rPr>
+                <w:sz w:val="19"/>
+              </w:rPr>
+              <w:t>P</w:t>
+            </w:r>
+          </w:p>
+        </w:tc>
+        <w:tc>
+          <w:tcPr>
+            <w:tcW w:type="dxa" w:w="2160"/>
+          </w:tcPr>
+          <w:p>
+            <w:pPr>
+              <w:keepNext w:val="0"/>
+              <w:spacing w:after="0" w:before="0"/>
+            </w:pPr>
+            <w:r/>
+            <w:r>
+              <w:rPr>
+                <w:sz w:val="19"/>
+              </w:rPr>
+              <w:t>+0.014 [−0.016, 0.055]</w:t>
+            </w:r>
+          </w:p>
+        </w:tc>
+        <w:tc>
+          <w:tcPr>
+            <w:tcW w:type="dxa" w:w="2160"/>
+          </w:tcPr>
+          <w:p>
+            <w:pPr>
+              <w:keepNext w:val="0"/>
+              <w:spacing w:after="0" w:before="0"/>
+            </w:pPr>
+            <w:r/>
+            <w:r>
+              <w:rPr>
+                <w:sz w:val="19"/>
+              </w:rPr>
+              <w:t>+0.006 [−0.031, 0.049]</w:t>
+            </w:r>
+          </w:p>
+        </w:tc>
+        <w:tc>
+          <w:tcPr>
+            <w:tcW w:type="dxa" w:w="2160"/>
+          </w:tcPr>
+          <w:p>
+            <w:pPr>
+              <w:keepNext w:val="0"/>
+              <w:spacing w:after="0" w:before="0"/>
+            </w:pPr>
+            <w:r/>
+            <w:r>
+              <w:rPr>
+                <w:sz w:val="19"/>
+              </w:rPr>
+              <w:t>−0.032 [−0.114, 0.037]</w:t>
+            </w:r>
+          </w:p>
+        </w:tc>
+      </w:tr>
+    </w:tbl>
+    <w:p>
+      <w:pPr>
+        <w:spacing w:after="40" w:line="120" w:lineRule="exact"/>
+      </w:pPr>
+    </w:p>
+    <w:p>
+      <w:pPr>
+        <w:spacing w:after="120"/>
+      </w:pPr>
+      <w:r>
+        <w:rPr>
+          <w:b w:val="0"/>
+          <w:i w:val="0"/>
+        </w:rPr>
+        <w:t>The reference curve is steeper than the human curve on both quantities (β slope +5.29 against +0.47 and +3.13; log-score gain slope +1.21 against +1.10 and +1.01). On β the human median is below the reference at every evaluation point for the public group and at the highest Q for superforecasters, and not distinguishable from it elsewhere. On the scale-free measure the superforecaster median is above the reference at all three points, and the public median is not distinguishable from it at any of them. Figure 3 shows the two log-score curves; the β figure is in the repository report.</w:t>
+      </w:r>
+    </w:p>
+    <w:p>
+      <w:pPr>
+        <w:pStyle w:val="Heading2"/>
+        <w:keepNext/>
+      </w:pPr>
+      <w:r>
+        <w:t>6.4 Reading</w:t>
+      </w:r>
+    </w:p>
+    <w:p>
+      <w:pPr>
+        <w:spacing w:after="120"/>
+      </w:pPr>
+      <w:r>
+        <w:rPr>
+          <w:b w:val="0"/>
+          <w:i w:val="0"/>
+        </w:rPr>
+        <w:t>One claim survives. On the out-of-sample log-score measure, the superforecaster median adds information that the median of the other 33 models does not, across the whole observed range of model quality. Everything else in this section is either not distinguishable from what another model-like source contributes or, for the public median on β, below it. The public H6 slope, which was the one pre-registered result to survive the leverage rule, does not survive the reference comparison on either quantity.</w:t>
+      </w:r>
+    </w:p>
+    <w:p>
+      <w:pPr>
+        <w:spacing w:after="120"/>
+      </w:pPr>
+      <w:r>
+        <w:rPr>
+          <w:b w:val="0"/>
+          <w:i w:val="0"/>
+        </w:rPr>
+        <w:t>This narrows Section 4.2. Relative to the best single model, both human medians carried information the model did not encompass, and that result stands. Relative to an ensemble of the other models, most of that information is available from the ensemble, and only the superforecasters add something beyond it. This reference is not the baseline (b) of Section 4.3; that was a benchmark the human was scored against, and this is a comparator for what the human contributes. The surviving claim rests on a robustness quantity tested by a post-results diagnostic, so it is exploratory. Two things qualify the comparison in the other direction. The reference is a 34-model ensemble, which was not a system anyone was running in July 2024; the single-model comparison of Section 4 is the deployable case. And the median of 33 forecasts is less noisy than the median of about 7 superforecasters or 49 public forecasters on a target, so a human curve below the reference mixes two things this design cannot separate: whether the human's information is distinct, and whether the human median is noisier than the ensemble.</w:t>
+      </w:r>
+    </w:p>
+    <w:p>
+      <w:pPr>
+        <w:pStyle w:val="Heading1"/>
+        <w:keepNext/>
+      </w:pPr>
+      <w:r>
+        <w:t>7. A post-hoc diagnostic of the scoring-rule reversal</w:t>
       </w:r>
     </w:p>
     <w:p>
@@ -2657,7 +3389,7 @@
           <w:b w:val="0"/>
           <w:i w:val="0"/>
         </w:rPr>
-        <w:t>The mechanism is a thin tail of confident errors. I count a row as confidently wrong when the forecast is at or beyond 0.9 on the wrong side of the outcome. The human share rises across quartiles from 0.88% to 3.14% to 3.64% to 23.5% in Q4. Benchmark (a) on the same rows goes from 1.98% to 0.00%, which is by construction: Q4 is where the human is far more extreme than a model that was not extreme. Figure 3 shows both series.</w:t>
+        <w:t>The mechanism is a thin tail of confident errors. I count a row as confidently wrong when the forecast is at or beyond 0.9 on the wrong side of the outcome. The human share rises across quartiles from 0.88% to 3.14% to 3.64% to 23.5% in Q4. Benchmark (a) on the same rows goes from 1.98% to 0.00%, which is by construction: Q4 is where the human is far more extreme than a model that was not extreme. Figure 4 shows both series.</w:t>
       </w:r>
     </w:p>
     <w:p>
@@ -2669,7 +3401,7 @@
         <w:drawing>
           <wp:inline xmlns:a="http://schemas.openxmlformats.org/drawingml/2006/main" xmlns:pic="http://schemas.openxmlformats.org/drawingml/2006/picture">
             <wp:extent cx="5669280" cy="2267712"/>
-            <wp:docPr id="3" name="Picture 3"/>
+            <wp:docPr id="4" name="Picture 4"/>
             <wp:cNvGraphicFramePr>
               <a:graphicFrameLocks noChangeAspect="1"/>
             </wp:cNvGraphicFramePr>
@@ -2681,7 +3413,7 @@
                     <pic:cNvPicPr/>
                   </pic:nvPicPr>
                   <pic:blipFill>
-                    <a:blip r:embed="rId11"/>
+                    <a:blip r:embed="rId12"/>
                     <a:stretch>
                       <a:fillRect/>
                     </a:stretch>
@@ -2709,7 +3441,7 @@
           <w:b/>
           <w:sz w:val="20"/>
         </w:rPr>
-        <w:t xml:space="preserve">Figure 3. </w:t>
+        <w:t xml:space="preserve">Figure 4. </w:t>
       </w:r>
       <w:r>
         <w:rPr>
@@ -2749,7 +3481,7 @@
         <w:keepNext/>
       </w:pPr>
       <w:r>
-        <w:t>7. Limitations</w:t>
+        <w:t>8. Limitations</w:t>
       </w:r>
     </w:p>
     <w:p>
@@ -2842,7 +3574,7 @@
         <w:keepNext/>
       </w:pPr>
       <w:r>
-        <w:t>8. Methods transparency</w:t>
+        <w:t>9. Methods transparency</w:t>
       </w:r>
     </w:p>
     <w:p>
@@ -2914,7 +3646,7 @@
           <w:b w:val="0"/>
           <w:i w:val="0"/>
         </w:rPr>
-        <w:t>Amendment 3, after the results, added the diagnostic in Section 6. It refit no model and changed no estimate.</w:t>
+        <w:t>Amendment 3, after the results, added the diagnostic in Section 7. It refit no model and changed no estimate.</w:t>
       </w:r>
     </w:p>
     <w:p>
@@ -2938,16 +3670,7 @@
           <w:b w:val="0"/>
           <w:i w:val="0"/>
         </w:rPr>
-        <w:t>The chess study to which this one is compared was published with the same discipline: a locked specification, disclosed faults, and a public repository. Both repositories carry the specification with all amendments in place, the code, and the reports the numbers in this paper are drawn from.</w:t>
-      </w:r>
-    </w:p>
-    <w:p>
-      <w:pPr>
-        <w:pStyle w:val="Heading1"/>
-        <w:keepNext/>
-      </w:pPr>
-      <w:r>
-        <w:t>9. Conclusion</w:t>
+        <w:t>SPEC v2 was locked and pushed on 2026-09-08 before its analysis ran. The first push contained a stale draft, corrected the same day by the commit the report names as governing. Its Amendment 1, after the pilot and before the full run, fixed the leverage rule and the co-primary unflagged refit, replaced an invalid stage-2 bootstrap for H7 with a validated inner-loop estimator and a demotion rule if the validation failed (it did), and required a per-variant boundary-warning column. Its Amendment 2, after the results, added the reference curve of Section 6.3 as a diagnostic with the reading fixed in advance; no pre-registered estimate was refit, and the human quantities recomputed inside the paired loop reproduced the stored bootstrap draws exactly. Of the 136 mixed-model ε fits in SPEC v2, 92 raised the boundary warning and 10 fell back to clustered OLS; the per-variant record is in the repository report.</w:t>
       </w:r>
     </w:p>
     <w:p>
@@ -2959,7 +3682,28 @@
           <w:b w:val="0"/>
           <w:i w:val="0"/>
         </w:rPr>
-        <w:t>In a domain where the benchmark can err, human deviation from it carries information the benchmark lacks. That was true for the median of superforecasters who beat the model and for the median of a crowd of independent public forecasters who did not. Whether the deviation pays depends on the direction and on how confident errors are priced, and where it pays is not where the models disagree. The return a forecaster earns over the model is a stable property of that forecaster within the round. Beside the chess result, where a strictly stronger benchmark left the human deviation with nothing to add, the pattern across the two cases is consistent with the fallibility of the benchmark deciding whether the human has anything to contribute, while leaving open where and in which direction. The next step in this line is a second round of individual-level data, so that the stability found here can be tested across time rather than across a split of one round.</w:t>
+        <w:t>The chess study to which this one is compared was published with the same discipline: a locked specification, disclosed faults, and a public repository. Both repositories carry the specification with all amendments in place, the code, and the reports the numbers in this paper are drawn from.</w:t>
+      </w:r>
+    </w:p>
+    <w:p>
+      <w:pPr>
+        <w:pStyle w:val="Heading1"/>
+        <w:keepNext/>
+      </w:pPr>
+      <w:r>
+        <w:t>10. Conclusion</w:t>
+      </w:r>
+    </w:p>
+    <w:p>
+      <w:pPr>
+        <w:spacing w:after="120"/>
+      </w:pPr>
+      <w:r>
+        <w:rPr>
+          <w:b w:val="0"/>
+          <w:i w:val="0"/>
+        </w:rPr>
+        <w:t>In a domain where the benchmark can err, human deviation from it carries information the best single model lacks. That was true for the median of superforecasters who beat the model and for the median of a crowd of independent public forecasters who did not. Against an ensemble of the other models, an exploratory comparison found that only the superforecasters add information, and within this generation of models the human's addition does not fall as the model improves. Whether the deviation pays depends on the direction and on how confident errors are priced, and where it pays is not where the models disagree. The return a forecaster earns over the model is a stable property of that forecaster within the round. Beside the chess result, where a strictly stronger benchmark left the human deviation with nothing to add, the pattern across the two cases is consistent with the fallibility of the benchmark deciding whether the human has anything to contribute, while leaving open where and in which direction. The next step in this line is a second round of individual-level data, so that the stability found here can be tested across time rather than across a split of one round.</w:t>
       </w:r>
     </w:p>
     <w:p>
@@ -2980,7 +3724,7 @@
           <w:b w:val="0"/>
           <w:i w:val="0"/>
         </w:rPr>
-        <w:t>The specification with all three amendments, the analysis code, the pilot and full-run reports, and the figures are in the public repository github.com/aaronsun923/forecast-complementarity, archived at https://doi.org/10.5281/zenodo.22600832. The ForecastBench data are published under CC BY-SA 4.0 by the ForecastBench project; the snapshot used here is identified by the hashes and commit recorded in the repository's provenance file. The chess study and its repository are cited below.</w:t>
+        <w:t>The two specifications with all their amendments, the analysis code, the pilot and full-run reports, and the figures are in the public repository github.com/aaronsun923/forecast-complementarity, archived at https://doi.org/10.5281/zenodo.22600832. The ForecastBench data are published under CC BY-SA 4.0 by the ForecastBench project; the snapshot used here is identified by the hashes and commit recorded in the repository's provenance file. The chess study and its repository are cited below.</w:t>
       </w:r>
     </w:p>
     <w:p>

</xml_diff>